<commit_message>
Fix GPS corpus count (2,526 runs, not 43,809); final Section 4 Word file
43,809 was the sum of per-route run counts (run-route incidences, 17.3 per
run), not a count of runs. Corrected to 2,526 service runs (2,426 after
map-matching) from 157 driver app accounts, 6 Feb-29 Jun 2026, in sections 0,
1, 3, 5 and 6, the cover letter, FINDINGS, claim-ledger CL-18, the gap notes
and the co-author corrections PDF.

Section4_Methodology_Final.docx: the v6 text with the 14 equation images,
Figure 4, Table 4.1, Algorithm 1 and page numbers. Tests: 242 passed.

Co-Authored-By: Claude Opus 5.5 <noreply@anthropic.com>
</commit_message>
<xml_diff>
--- a/paper/Section4_Methodology_v6.docx
+++ b/paper/Section4_Methodology_v6.docx
@@ -60,7 +60,7 @@
                     </pic:cNvPicPr>
                   </pic:nvPicPr>
                   <pic:blipFill>
-                    <a:blip r:embed="rId7" cstate="none"/>
+                    <a:blip r:embed="rId8" cstate="none"/>
                     <a:srcRect/>
                     <a:stretch>
                       <a:fillRect/>
@@ -1204,145 +1204,6 @@
                   <wp:extent cx="3343275" cy="342900"/>
                   <wp:effectExtent t="0" r="0" b="0" l="0"/>
                   <wp:docPr id="2" name="eq1" descr="A_{net}(r) = \bigcup_{v \in V :\, d(v) \leq W} B\left(x_v,\ \min(W - d(v),\ \tau)\right)" title="Equation 1"/>
-                  <wp:cNvGraphicFramePr>
-                    <a:graphicFrameLocks xmlns:a="http://schemas.openxmlformats.org/drawingml/2006/main" noChangeAspect="1"/>
-                  </wp:cNvGraphicFramePr>
-                  <a:graphic xmlns:a="http://schemas.openxmlformats.org/drawingml/2006/main">
-                    <a:graphicData uri="http://schemas.openxmlformats.org/drawingml/2006/picture">
-                      <pic:pic xmlns:pic="http://schemas.openxmlformats.org/drawingml/2006/picture">
-                        <pic:nvPicPr>
-                          <pic:cNvPr id="0" name="" descr=""/>
-                          <pic:cNvPicPr>
-                            <a:picLocks noChangeAspect="1" noChangeArrowheads="1"/>
-                          </pic:cNvPicPr>
-                        </pic:nvPicPr>
-                        <pic:blipFill>
-                          <a:blip r:embed="rId8" cstate="none"/>
-                          <a:srcRect/>
-                          <a:stretch>
-                            <a:fillRect/>
-                          </a:stretch>
-                        </pic:blipFill>
-                        <pic:spPr bwMode="auto">
-                          <a:xfrm>
-                            <a:off x="0" y="0"/>
-                            <a:ext cx="3343275" cy="342900"/>
-                          </a:xfrm>
-                          <a:prstGeom prst="rect">
-                            <a:avLst/>
-                          </a:prstGeom>
-                        </pic:spPr>
-                      </pic:pic>
-                    </a:graphicData>
-                  </a:graphic>
-                </wp:inline>
-              </w:drawing>
-            </w:r>
-          </w:p>
-        </w:tc>
-        <w:tc>
-          <w:tcPr>
-            <w:tcW w:type="dxa" w:w="700"/>
-            <w:tcBorders>
-              <w:top w:val="none" w:color="FFFFFF" w:sz="0"/>
-              <w:left w:val="none" w:color="FFFFFF" w:sz="0"/>
-              <w:bottom w:val="none" w:color="FFFFFF" w:sz="0"/>
-              <w:right w:val="none" w:color="FFFFFF" w:sz="0"/>
-            </w:tcBorders>
-            <w:vAlign w:val="center"/>
-          </w:tcPr>
-          <w:p>
-            <w:pPr>
-              <w:spacing w:after="100" w:before="100"/>
-              <w:jc w:val="right"/>
-            </w:pPr>
-            <w:r>
-              <w:t xml:space="preserve">(1)</w:t>
-            </w:r>
-          </w:p>
-        </w:tc>
-      </w:tr>
-    </w:tbl>
-    <w:p>
-      <w:pPr>
-        <w:jc w:val="both"/>
-      </w:pPr>
-      <w:r>
-        <w:t xml:space="preserve">where </w:t>
-      </w:r>
-      <w:r>
-        <w:rPr>
-          <w:i/>
-          <w:iCs/>
-        </w:rPr>
-        <w:t xml:space="preserve">B</w:t>
-      </w:r>
-      <w:r>
-        <w:t xml:space="preserve">(</w:t>
-      </w:r>
-      <w:r>
-        <w:rPr>
-          <w:i/>
-          <w:iCs/>
-        </w:rPr>
-        <w:t xml:space="preserve">x</w:t>
-      </w:r>
-      <w:r>
-        <w:t xml:space="preserve">, δ) is the disc of radius δ centred on </w:t>
-      </w:r>
-      <w:r>
-        <w:rPr>
-          <w:i/>
-          <w:iCs/>
-        </w:rPr>
-        <w:t xml:space="preserve">x</w:t>
-      </w:r>
-      <w:r>
-        <w:t xml:space="preserve">. Its residents are</w:t>
-      </w:r>
-    </w:p>
-    <w:tbl>
-      <w:tblPr>
-        <w:tblW w:type="dxa" w:w="9026"/>
-        <w:tblBorders>
-          <w:top w:val="none" w:color="FFFFFF" w:sz="0"/>
-          <w:left w:val="none" w:color="FFFFFF" w:sz="0"/>
-          <w:bottom w:val="none" w:color="FFFFFF" w:sz="0"/>
-          <w:right w:val="none" w:color="FFFFFF" w:sz="0"/>
-          <w:insideH w:val="none" w:color="FFFFFF" w:sz="0"/>
-          <w:insideV w:val="none" w:color="FFFFFF" w:sz="0"/>
-        </w:tblBorders>
-      </w:tblPr>
-      <w:tblGrid>
-        <w:gridCol w:w="8326"/>
-        <w:gridCol w:w="700"/>
-      </w:tblGrid>
-      <w:tr>
-        <w:trPr>
-          <w:cantSplit/>
-        </w:trPr>
-        <w:tc>
-          <w:tcPr>
-            <w:tcW w:type="dxa" w:w="8326"/>
-            <w:tcBorders>
-              <w:top w:val="none" w:color="FFFFFF" w:sz="0"/>
-              <w:left w:val="none" w:color="FFFFFF" w:sz="0"/>
-              <w:bottom w:val="none" w:color="FFFFFF" w:sz="0"/>
-              <w:right w:val="none" w:color="FFFFFF" w:sz="0"/>
-            </w:tcBorders>
-            <w:vAlign w:val="center"/>
-          </w:tcPr>
-          <w:p>
-            <w:pPr>
-              <w:spacing w:after="100" w:before="100"/>
-              <w:jc w:val="center"/>
-            </w:pPr>
-            <w:r>
-              <w:drawing>
-                <wp:inline distT="0" distB="0" distL="0" distR="0">
-                  <wp:extent cx="1447800" cy="381000"/>
-                  <wp:effectExtent t="0" r="0" b="0" l="0"/>
-                  <wp:docPr id="3" name="eq2" descr="\Pi(r) = \sum_{c :\, x_c \in A_{net}(r)} \rho_c" title="Equation 2"/>
                   <wp:cNvGraphicFramePr>
                     <a:graphicFrameLocks xmlns:a="http://schemas.openxmlformats.org/drawingml/2006/main" noChangeAspect="1"/>
                   </wp:cNvGraphicFramePr>
@@ -1365,7 +1226,7 @@
                         <pic:spPr bwMode="auto">
                           <a:xfrm>
                             <a:off x="0" y="0"/>
-                            <a:ext cx="1447800" cy="381000"/>
+                            <a:ext cx="3343275" cy="342900"/>
                           </a:xfrm>
                           <a:prstGeom prst="rect">
                             <a:avLst/>
@@ -1396,7 +1257,7 @@
               <w:jc w:val="right"/>
             </w:pPr>
             <w:r>
-              <w:t xml:space="preserve">(2)</w:t>
+              <w:t xml:space="preserve">(1)</w:t>
             </w:r>
           </w:p>
         </w:tc>
@@ -1407,23 +1268,37 @@
         <w:jc w:val="both"/>
       </w:pPr>
       <w:r>
-        <w:t xml:space="preserve">Routes that run side by side share residents, so their counts cannot be added. For network totals each cell is split equally among the </w:t>
-      </w:r>
-      <w:r>
-        <w:rPr>
-          <w:i/>
-          <w:iCs/>
-        </w:rPr>
-        <w:t xml:space="preserve">n</w:t>
-      </w:r>
-      <w:r>
-        <w:rPr>
-          <w:vertAlign w:val="subscript"/>
-        </w:rPr>
-        <w:t xml:space="preserve">c</w:t>
-      </w:r>
-      <w:r>
-        <w:t xml:space="preserve"> routes whose catchments contain it,</w:t>
+        <w:t xml:space="preserve">where </w:t>
+      </w:r>
+      <w:r>
+        <w:rPr>
+          <w:i/>
+          <w:iCs/>
+        </w:rPr>
+        <w:t xml:space="preserve">B</w:t>
+      </w:r>
+      <w:r>
+        <w:t xml:space="preserve">(</w:t>
+      </w:r>
+      <w:r>
+        <w:rPr>
+          <w:i/>
+          <w:iCs/>
+        </w:rPr>
+        <w:t xml:space="preserve">x</w:t>
+      </w:r>
+      <w:r>
+        <w:t xml:space="preserve">, δ) is the disc of radius δ centred on </w:t>
+      </w:r>
+      <w:r>
+        <w:rPr>
+          <w:i/>
+          <w:iCs/>
+        </w:rPr>
+        <w:t xml:space="preserve">x</w:t>
+      </w:r>
+      <w:r>
+        <w:t xml:space="preserve">. Its residents are</w:t>
       </w:r>
     </w:p>
     <w:tbl>
@@ -1465,9 +1340,9 @@
             <w:r>
               <w:drawing>
                 <wp:inline distT="0" distB="0" distL="0" distR="0">
-                  <wp:extent cx="3076575" cy="390525"/>
+                  <wp:extent cx="1447800" cy="381000"/>
                   <wp:effectExtent t="0" r="0" b="0" l="0"/>
-                  <wp:docPr id="4" name="eq3" descr="\pi_c(r) = \frac{\rho_c}{n_c}\,\mathbf{1}[x_c \in A_{net}(r)], \qquad \sum_r \pi_c(r) = \rho_c" title="Equation 3"/>
+                  <wp:docPr id="3" name="eq2" descr="\Pi(r) = \sum_{c :\, x_c \in A_{net}(r)} \rho_c" title="Equation 2"/>
                   <wp:cNvGraphicFramePr>
                     <a:graphicFrameLocks xmlns:a="http://schemas.openxmlformats.org/drawingml/2006/main" noChangeAspect="1"/>
                   </wp:cNvGraphicFramePr>
@@ -1490,7 +1365,7 @@
                         <pic:spPr bwMode="auto">
                           <a:xfrm>
                             <a:off x="0" y="0"/>
-                            <a:ext cx="3076575" cy="390525"/>
+                            <a:ext cx="1447800" cy="381000"/>
                           </a:xfrm>
                           <a:prstGeom prst="rect">
                             <a:avLst/>
@@ -1521,7 +1396,7 @@
               <w:jc w:val="right"/>
             </w:pPr>
             <w:r>
-              <w:t xml:space="preserve">(3)</w:t>
+              <w:t xml:space="preserve">(2)</w:t>
             </w:r>
           </w:p>
         </w:tc>
@@ -1532,100 +1407,23 @@
         <w:jc w:val="both"/>
       </w:pPr>
       <w:r>
-        <w:t xml:space="preserve">so that the shares add up to the population of the combined catchment. The budget </w:t>
-      </w:r>
-      <w:r>
-        <w:rPr>
-          <w:i/>
-          <w:iCs/>
-        </w:rPr>
-        <w:t xml:space="preserve">W</w:t>
-      </w:r>
-      <w:r>
-        <w:t xml:space="preserve"> is varied from 300 to 800 m in Section 4.11. Walking distance is the only access measure; the quality of the walking environment, which also affects willingness to walk (Bivina et al., 2019), is not modelled.</w:t>
-      </w:r>
-    </w:p>
-    <w:p>
-      <w:pPr>
-        <w:pStyle w:val="Heading2"/>
-        <w:keepNext/>
-      </w:pPr>
-      <w:r>
-        <w:t xml:space="preserve">4.5 Destinations and the composite index</w:t>
-      </w:r>
-    </w:p>
-    <w:p>
-      <w:pPr>
-        <w:jc w:val="both"/>
-      </w:pPr>
-      <w:r>
-        <w:t xml:space="preserve">Destinations show what a route connects residents to. They were counted as cumulative opportunities (Geurs and van Wee, 2004): point </w:t>
-      </w:r>
-      <w:r>
-        <w:rPr>
-          <w:i/>
-          <w:iCs/>
-        </w:rPr>
-        <w:t xml:space="preserve">q</w:t>
-      </w:r>
-      <w:r>
-        <w:t xml:space="preserve"> counts towards route </w:t>
-      </w:r>
-      <w:r>
-        <w:rPr>
-          <w:i/>
-          <w:iCs/>
-        </w:rPr>
-        <w:t xml:space="preserve">r</w:t>
-      </w:r>
-      <w:r>
-        <w:t xml:space="preserve"> when its walking distance to the nearest stop, </w:t>
-      </w:r>
-      <w:r>
-        <w:rPr>
-          <w:i/>
-          <w:iCs/>
-        </w:rPr>
-        <w:t xml:space="preserve">d</w:t>
+        <w:t xml:space="preserve">Routes that run side by side share residents, so their counts cannot be added. For network totals each cell is split equally among the </w:t>
+      </w:r>
+      <w:r>
+        <w:rPr>
+          <w:i/>
+          <w:iCs/>
+        </w:rPr>
+        <w:t xml:space="preserve">n</w:t>
       </w:r>
       <w:r>
         <w:rPr>
           <w:vertAlign w:val="subscript"/>
         </w:rPr>
-        <w:t xml:space="preserve">q</w:t>
-      </w:r>
-      <w:r>
-        <w:t xml:space="preserve">(</w:t>
-      </w:r>
-      <w:r>
-        <w:rPr>
-          <w:i/>
-          <w:iCs/>
-        </w:rPr>
-        <w:t xml:space="preserve">r</w:t>
-      </w:r>
-      <w:r>
-        <w:t xml:space="preserve">), is at most 250 m, with the weight α of its tier </w:t>
-      </w:r>
-      <w:r>
-        <w:rPr>
-          <w:i/>
-          <w:iCs/>
-        </w:rPr>
-        <w:t xml:space="preserve">t</w:t>
-      </w:r>
-      <w:r>
-        <w:t xml:space="preserve">(</w:t>
-      </w:r>
-      <w:r>
-        <w:rPr>
-          <w:i/>
-          <w:iCs/>
-        </w:rPr>
-        <w:t xml:space="preserve">q</w:t>
-      </w:r>
-      <w:r>
-        <w:t xml:space="preserve">),</w:t>
+        <w:t xml:space="preserve">c</w:t>
+      </w:r>
+      <w:r>
+        <w:t xml:space="preserve"> routes whose catchments contain it,</w:t>
       </w:r>
     </w:p>
     <w:tbl>
@@ -1667,9 +1465,9 @@
             <w:r>
               <w:drawing>
                 <wp:inline distT="0" distB="0" distL="0" distR="0">
-                  <wp:extent cx="1962150" cy="400050"/>
+                  <wp:extent cx="3076575" cy="390525"/>
                   <wp:effectExtent t="0" r="0" b="0" l="0"/>
-                  <wp:docPr id="5" name="eq4" descr="O(r) = \sum_{q \in Q :\, d_q(r) \leq 250\,\mathrm{m}} \alpha_{t(q)}" title="Equation 4"/>
+                  <wp:docPr id="4" name="eq3" descr="\pi_c(r) = \frac{\rho_c}{n_c}\,\mathbf{1}[x_c \in A_{net}(r)], \qquad \sum_r \pi_c(r) = \rho_c" title="Equation 3"/>
                   <wp:cNvGraphicFramePr>
                     <a:graphicFrameLocks xmlns:a="http://schemas.openxmlformats.org/drawingml/2006/main" noChangeAspect="1"/>
                   </wp:cNvGraphicFramePr>
@@ -1692,7 +1490,7 @@
                         <pic:spPr bwMode="auto">
                           <a:xfrm>
                             <a:off x="0" y="0"/>
-                            <a:ext cx="1962150" cy="400050"/>
+                            <a:ext cx="3076575" cy="390525"/>
                           </a:xfrm>
                           <a:prstGeom prst="rect">
                             <a:avLst/>
@@ -1723,7 +1521,7 @@
               <w:jc w:val="right"/>
             </w:pPr>
             <w:r>
-              <w:t xml:space="preserve">(4)</w:t>
+              <w:t xml:space="preserve">(3)</w:t>
             </w:r>
           </w:p>
         </w:tc>
@@ -1734,7 +1532,26 @@
         <w:jc w:val="both"/>
       </w:pPr>
       <w:r>
-        <w:t xml:space="preserve">Tiers were assigned from OpenStreetMap tags and 67 name rules for known landmarks, with α = 1.00 for major destinations (1,030 points), 0.40 for others (1,080) and 0.60 for seasonal visitor sites (321). The tiers are coarse: every mapped place of worship is in the top tier, accounting for 547 of its points. The weights and tier rules are our assumptions; no weights were elicited from experts. The plan itself measured the 250 m in a straight line.</w:t>
+        <w:t xml:space="preserve">so that the shares add up to the population of the combined catchment. The budget </w:t>
+      </w:r>
+      <w:r>
+        <w:rPr>
+          <w:i/>
+          <w:iCs/>
+        </w:rPr>
+        <w:t xml:space="preserve">W</w:t>
+      </w:r>
+      <w:r>
+        <w:t xml:space="preserve"> is varied from 300 to 800 m in Section 4.11. Walking distance is the only access measure; the quality of the walking environment, which also affects willingness to walk (Bivina et al., 2019), is not modelled.</w:t>
+      </w:r>
+    </w:p>
+    <w:p>
+      <w:pPr>
+        <w:pStyle w:val="Heading2"/>
+        <w:keepNext/>
+      </w:pPr>
+      <w:r>
+        <w:t xml:space="preserve">4.5 Destinations and the composite index</w:t>
       </w:r>
     </w:p>
     <w:p>
@@ -1742,17 +1559,73 @@
         <w:jc w:val="both"/>
       </w:pPr>
       <w:r>
-        <w:t xml:space="preserve">Because a residential surface does not count visitors, the plan raised the resident count of the eight tourist routes, the set </w:t>
-      </w:r>
-      <w:r>
-        <w:rPr>
-          <w:i/>
-          <w:iCs/>
-        </w:rPr>
-        <w:t xml:space="preserve">T</w:t>
-      </w:r>
-      <w:r>
-        <w:t xml:space="preserve">, by a factor μ:</w:t>
+        <w:t xml:space="preserve">Destinations show what a route connects residents to. They were counted as cumulative opportunities (Geurs and van Wee, 2004): point </w:t>
+      </w:r>
+      <w:r>
+        <w:rPr>
+          <w:i/>
+          <w:iCs/>
+        </w:rPr>
+        <w:t xml:space="preserve">q</w:t>
+      </w:r>
+      <w:r>
+        <w:t xml:space="preserve"> counts towards route </w:t>
+      </w:r>
+      <w:r>
+        <w:rPr>
+          <w:i/>
+          <w:iCs/>
+        </w:rPr>
+        <w:t xml:space="preserve">r</w:t>
+      </w:r>
+      <w:r>
+        <w:t xml:space="preserve"> when its walking distance to the nearest stop, </w:t>
+      </w:r>
+      <w:r>
+        <w:rPr>
+          <w:i/>
+          <w:iCs/>
+        </w:rPr>
+        <w:t xml:space="preserve">d</w:t>
+      </w:r>
+      <w:r>
+        <w:rPr>
+          <w:vertAlign w:val="subscript"/>
+        </w:rPr>
+        <w:t xml:space="preserve">q</w:t>
+      </w:r>
+      <w:r>
+        <w:t xml:space="preserve">(</w:t>
+      </w:r>
+      <w:r>
+        <w:rPr>
+          <w:i/>
+          <w:iCs/>
+        </w:rPr>
+        <w:t xml:space="preserve">r</w:t>
+      </w:r>
+      <w:r>
+        <w:t xml:space="preserve">), is at most 250 m, with the weight α of its tier </w:t>
+      </w:r>
+      <w:r>
+        <w:rPr>
+          <w:i/>
+          <w:iCs/>
+        </w:rPr>
+        <w:t xml:space="preserve">t</w:t>
+      </w:r>
+      <w:r>
+        <w:t xml:space="preserve">(</w:t>
+      </w:r>
+      <w:r>
+        <w:rPr>
+          <w:i/>
+          <w:iCs/>
+        </w:rPr>
+        <w:t xml:space="preserve">q</w:t>
+      </w:r>
+      <w:r>
+        <w:t xml:space="preserve">),</w:t>
       </w:r>
     </w:p>
     <w:tbl>
@@ -1794,9 +1667,9 @@
             <w:r>
               <w:drawing>
                 <wp:inline distT="0" distB="0" distL="0" distR="0">
-                  <wp:extent cx="4848225" cy="238125"/>
+                  <wp:extent cx="1962150" cy="400050"/>
                   <wp:effectExtent t="0" r="0" b="0" l="0"/>
-                  <wp:docPr id="6" name="eq5" descr="\Pi^{*}(r) = \mu\, \Pi(r)\ \ \mathrm{if}\ r \in T, \qquad \Pi^{*}(r) = \Pi(r)\ \ \mathrm{otherwise}, \qquad \mu = 1.30" title="Equation 5"/>
+                  <wp:docPr id="5" name="eq4" descr="O(r) = \sum_{q \in Q :\, d_q(r) \leq 250\,\mathrm{m}} \alpha_{t(q)}" title="Equation 4"/>
                   <wp:cNvGraphicFramePr>
                     <a:graphicFrameLocks xmlns:a="http://schemas.openxmlformats.org/drawingml/2006/main" noChangeAspect="1"/>
                   </wp:cNvGraphicFramePr>
@@ -1819,7 +1692,7 @@
                         <pic:spPr bwMode="auto">
                           <a:xfrm>
                             <a:off x="0" y="0"/>
-                            <a:ext cx="4848225" cy="238125"/>
+                            <a:ext cx="1962150" cy="400050"/>
                           </a:xfrm>
                           <a:prstGeom prst="rect">
                             <a:avLst/>
@@ -1850,7 +1723,7 @@
               <w:jc w:val="right"/>
             </w:pPr>
             <w:r>
-              <w:t xml:space="preserve">(5)</w:t>
+              <w:t xml:space="preserve">(4)</w:t>
             </w:r>
           </w:p>
         </w:tc>
@@ -1861,7 +1734,7 @@
         <w:jc w:val="both"/>
       </w:pPr>
       <w:r>
-        <w:t xml:space="preserve">It changes their index but not network coverage.</w:t>
+        <w:t xml:space="preserve">Tiers were assigned from OpenStreetMap tags and 67 name rules for known landmarks, with α = 1.00 for major destinations (1,030 points), 0.40 for others (1,080) and 0.60 for seasonal visitor sites (321). The tiers are coarse: every mapped place of worship is in the top tier, accounting for 547 of its points. The weights and tier rules are our assumptions; no weights were elicited from experts. The plan itself measured the 250 m in a straight line.</w:t>
       </w:r>
     </w:p>
     <w:p>
@@ -1869,7 +1742,17 @@
         <w:jc w:val="both"/>
       </w:pPr>
       <w:r>
-        <w:t xml:space="preserve">For a single ranking, both measures were divided by route length so that long routes do not score higher for length alone, density was capped at its 95th percentile so that a few very dense routes do not compress the rest, and each was rescaled across routes,</w:t>
+        <w:t xml:space="preserve">Because a residential surface does not count visitors, the plan raised the resident count of the eight tourist routes, the set </w:t>
+      </w:r>
+      <w:r>
+        <w:rPr>
+          <w:i/>
+          <w:iCs/>
+        </w:rPr>
+        <w:t xml:space="preserve">T</w:t>
+      </w:r>
+      <w:r>
+        <w:t xml:space="preserve">, by a factor μ:</w:t>
       </w:r>
     </w:p>
     <w:tbl>
@@ -1911,9 +1794,9 @@
             <w:r>
               <w:drawing>
                 <wp:inline distT="0" distB="0" distL="0" distR="0">
-                  <wp:extent cx="2028825" cy="609600"/>
+                  <wp:extent cx="4848225" cy="238125"/>
                   <wp:effectExtent t="0" r="0" b="0" l="0"/>
-                  <wp:docPr id="7" name="eq6" descr="\hat{z}(r) = \frac{z(r) - \min_{r'} z(r')}{\max_{r'} z(r') - \min_{r'} z(r')}" title="Equation 6"/>
+                  <wp:docPr id="6" name="eq5" descr="\Pi^{*}(r) = \mu\, \Pi(r)\ \ \mathrm{if}\ r \in T, \qquad \Pi^{*}(r) = \Pi(r)\ \ \mathrm{otherwise}, \qquad \mu = 1.30" title="Equation 5"/>
                   <wp:cNvGraphicFramePr>
                     <a:graphicFrameLocks xmlns:a="http://schemas.openxmlformats.org/drawingml/2006/main" noChangeAspect="1"/>
                   </wp:cNvGraphicFramePr>
@@ -1936,7 +1819,7 @@
                         <pic:spPr bwMode="auto">
                           <a:xfrm>
                             <a:off x="0" y="0"/>
-                            <a:ext cx="2028825" cy="609600"/>
+                            <a:ext cx="4848225" cy="238125"/>
                           </a:xfrm>
                           <a:prstGeom prst="rect">
                             <a:avLst/>
@@ -1967,7 +1850,7 @@
               <w:jc w:val="right"/>
             </w:pPr>
             <w:r>
-              <w:t xml:space="preserve">(6)</w:t>
+              <w:t xml:space="preserve">(5)</w:t>
             </w:r>
           </w:p>
         </w:tc>
@@ -1978,7 +1861,15 @@
         <w:jc w:val="both"/>
       </w:pPr>
       <w:r>
-        <w:t xml:space="preserve">and the rescaled values were combined with weight β on residents (OECD and European Commission, Joint Research Centre, 2008):</w:t>
+        <w:t xml:space="preserve">It changes their index but not network coverage.</w:t>
+      </w:r>
+    </w:p>
+    <w:p>
+      <w:pPr>
+        <w:jc w:val="both"/>
+      </w:pPr>
+      <w:r>
+        <w:t xml:space="preserve">For a single ranking, both measures were divided by route length so that long routes do not score higher for length alone, density was capped at its 95th percentile so that a few very dense routes do not compress the rest, and each was rescaled across routes,</w:t>
       </w:r>
     </w:p>
     <w:tbl>
@@ -2020,9 +1911,9 @@
             <w:r>
               <w:drawing>
                 <wp:inline distT="0" distB="0" distL="0" distR="0">
-                  <wp:extent cx="3305175" cy="219075"/>
+                  <wp:extent cx="2028825" cy="609600"/>
                   <wp:effectExtent t="0" r="0" b="0" l="0"/>
-                  <wp:docPr id="8" name="eq7" descr="CDI(r) = \beta\, \hat{z}_{\Pi}(r) + (1 - \beta)\, \hat{z}_{O}(r), \qquad \beta = 0.50" title="Equation 7"/>
+                  <wp:docPr id="7" name="eq6" descr="\hat{z}(r) = \frac{z(r) - \min_{r'} z(r')}{\max_{r'} z(r') - \min_{r'} z(r')}" title="Equation 6"/>
                   <wp:cNvGraphicFramePr>
                     <a:graphicFrameLocks xmlns:a="http://schemas.openxmlformats.org/drawingml/2006/main" noChangeAspect="1"/>
                   </wp:cNvGraphicFramePr>
@@ -2045,7 +1936,7 @@
                         <pic:spPr bwMode="auto">
                           <a:xfrm>
                             <a:off x="0" y="0"/>
-                            <a:ext cx="3305175" cy="219075"/>
+                            <a:ext cx="2028825" cy="609600"/>
                           </a:xfrm>
                           <a:prstGeom prst="rect">
                             <a:avLst/>
@@ -2076,7 +1967,7 @@
               <w:jc w:val="right"/>
             </w:pPr>
             <w:r>
-              <w:t xml:space="preserve">(7)</w:t>
+              <w:t xml:space="preserve">(6)</w:t>
             </w:r>
           </w:p>
         </w:tc>
@@ -2087,131 +1978,7 @@
         <w:jc w:val="both"/>
       </w:pPr>
       <w:r>
-        <w:t xml:space="preserve">Here ẑ</w:t>
-      </w:r>
-      <w:r>
-        <w:rPr>
-          <w:vertAlign w:val="subscript"/>
-        </w:rPr>
-        <w:t xml:space="preserve">Π</w:t>
-      </w:r>
-      <w:r>
-        <w:t xml:space="preserve"> and ẑ</w:t>
-      </w:r>
-      <w:r>
-        <w:rPr>
-          <w:vertAlign w:val="subscript"/>
-        </w:rPr>
-        <w:t xml:space="preserve">O</w:t>
-      </w:r>
-      <w:r>
-        <w:t xml:space="preserve"> are the rescaled values of Π</w:t>
-      </w:r>
-      <w:r>
-        <w:rPr>
-          <w:vertAlign w:val="superscript"/>
-        </w:rPr>
-        <w:t xml:space="preserve">*</w:t>
-      </w:r>
-      <w:r>
-        <w:t xml:space="preserve">(</w:t>
-      </w:r>
-      <w:r>
-        <w:rPr>
-          <w:i/>
-          <w:iCs/>
-        </w:rPr>
-        <w:t xml:space="preserve">r</w:t>
-      </w:r>
-      <w:r>
-        <w:t xml:space="preserve">)/ℓ(</w:t>
-      </w:r>
-      <w:r>
-        <w:rPr>
-          <w:i/>
-          <w:iCs/>
-        </w:rPr>
-        <w:t xml:space="preserve">r</w:t>
-      </w:r>
-      <w:r>
-        <w:t xml:space="preserve">) and </w:t>
-      </w:r>
-      <w:r>
-        <w:rPr>
-          <w:i/>
-          <w:iCs/>
-        </w:rPr>
-        <w:t xml:space="preserve">O</w:t>
-      </w:r>
-      <w:r>
-        <w:t xml:space="preserve">(</w:t>
-      </w:r>
-      <w:r>
-        <w:rPr>
-          <w:i/>
-          <w:iCs/>
-        </w:rPr>
-        <w:t xml:space="preserve">r</w:t>
-      </w:r>
-      <w:r>
-        <w:t xml:space="preserve">)/ℓ(</w:t>
-      </w:r>
-      <w:r>
-        <w:rPr>
-          <w:i/>
-          <w:iCs/>
-        </w:rPr>
-        <w:t xml:space="preserve">r</w:t>
-      </w:r>
-      <w:r>
-        <w:t xml:space="preserve">). The two components are strongly correlated (Pearson's </w:t>
-      </w:r>
-      <w:r>
-        <w:rPr>
-          <w:i/>
-          <w:iCs/>
-        </w:rPr>
-        <w:t xml:space="preserve">r</w:t>
-      </w:r>
-      <w:r>
-        <w:t xml:space="preserve"> = 0.89 with network catchments), so the index is close to a ranking by population density with a destination adjustment. Principal-component weights (Jolliffe, 2002) equal the equal weights when there are two components, so Section 5 compares equal weights with entropy weights (Shannon, 1948; Zou et al., 2006) and with β from 0.2 to 0.8. The index indicates where demand is likely to be; it does not measure demand.</w:t>
-      </w:r>
-    </w:p>
-    <w:p>
-      <w:pPr>
-        <w:pStyle w:val="Heading2"/>
-        <w:keepNext/>
-      </w:pPr>
-      <w:r>
-        <w:t xml:space="preserve">4.6 Merging overlapping routes</w:t>
-      </w:r>
-    </w:p>
-    <w:p>
-      <w:pPr>
-        <w:jc w:val="both"/>
-      </w:pPr>
-      <w:r>
-        <w:t xml:space="preserve">Where several services share a road, the network should run one of them. Overlap between two routes is measured on 80 m buffers </w:t>
-      </w:r>
-      <w:r>
-        <w:rPr>
-          <w:i/>
-          <w:iCs/>
-        </w:rPr>
-        <w:t xml:space="preserve">S</w:t>
-      </w:r>
-      <w:r>
-        <w:t xml:space="preserve">(</w:t>
-      </w:r>
-      <w:r>
-        <w:rPr>
-          <w:i/>
-          <w:iCs/>
-        </w:rPr>
-        <w:t xml:space="preserve">r</w:t>
-      </w:r>
-      <w:r>
-        <w:t xml:space="preserve">) around their lines:</w:t>
+        <w:t xml:space="preserve">and the rescaled values were combined with weight β on residents (OECD and European Commission, Joint Research Centre, 2008):</w:t>
       </w:r>
     </w:p>
     <w:tbl>
@@ -2253,9 +2020,9 @@
             <w:r>
               <w:drawing>
                 <wp:inline distT="0" distB="0" distL="0" distR="0">
-                  <wp:extent cx="2219325" cy="457200"/>
+                  <wp:extent cx="3305175" cy="219075"/>
                   <wp:effectExtent t="0" r="0" b="0" l="0"/>
-                  <wp:docPr id="9" name="eq8" descr="\phi(r_i, r_j) = \frac{|S(r_i) \cap S(r_j)|}{\min(|S(r_i)|,\ |S(r_j)|)}" title="Equation 8"/>
+                  <wp:docPr id="8" name="eq7" descr="CDI(r) = \beta\, \hat{z}_{\Pi}(r) + (1 - \beta)\, \hat{z}_{O}(r), \qquad \beta = 0.50" title="Equation 7"/>
                   <wp:cNvGraphicFramePr>
                     <a:graphicFrameLocks xmlns:a="http://schemas.openxmlformats.org/drawingml/2006/main" noChangeAspect="1"/>
                   </wp:cNvGraphicFramePr>
@@ -2278,7 +2045,7 @@
                         <pic:spPr bwMode="auto">
                           <a:xfrm>
                             <a:off x="0" y="0"/>
-                            <a:ext cx="2219325" cy="457200"/>
+                            <a:ext cx="3305175" cy="219075"/>
                           </a:xfrm>
                           <a:prstGeom prst="rect">
                             <a:avLst/>
@@ -2309,7 +2076,7 @@
               <w:jc w:val="right"/>
             </w:pPr>
             <w:r>
-              <w:t xml:space="preserve">(8)</w:t>
+              <w:t xml:space="preserve">(7)</w:t>
             </w:r>
           </w:p>
         </w:tc>
@@ -2320,165 +2087,94 @@
         <w:jc w:val="both"/>
       </w:pPr>
       <w:r>
-        <w:t xml:space="preserve">A trunk is the highest-ranked route of its overlap group, and a member joins it only when φ ≥ θ = 0.65 and their start points lie within 2.5 km; members are never merged with each other and e-bus routes are never absorbed (Algorithm 1). The buffer, θ and the 2.5 km tolerance are our assumptions.</w:t>
-      </w:r>
-    </w:p>
-    <w:p>
-      <w:pPr>
-        <w:keepNext/>
-        <w:keepLines/>
-        <w:pBdr>
-          <w:top w:val="single" w:color="808080" w:sz="6" w:space="4"/>
-        </w:pBdr>
-        <w:shd w:fill="F2F2F2" w:color="auto" w:val="clear"/>
-        <w:spacing w:after="40" w:before="120"/>
-        <w:ind w:left="360" w:right="360"/>
-      </w:pPr>
-      <w:r>
-        <w:rPr>
-          <w:b/>
-          <w:bCs/>
-          <w:sz w:val="22"/>
-          <w:szCs w:val="22"/>
-        </w:rPr>
-        <w:t xml:space="preserve">Algorithm 1. Merging overlapping routes</w:t>
-      </w:r>
-    </w:p>
-    <w:p>
-      <w:pPr>
-        <w:keepNext/>
-        <w:keepLines/>
-        <w:shd w:fill="F2F2F2" w:color="auto" w:val="clear"/>
-        <w:spacing w:after="40" w:before="0"/>
-        <w:ind w:left="360" w:right="360"/>
-      </w:pPr>
-      <w:r>
-        <w:rPr>
-          <w:b w:val="false"/>
-          <w:bCs w:val="false"/>
-          <w:sz w:val="22"/>
-          <w:szCs w:val="22"/>
-        </w:rPr>
-        <w:t xml:space="preserve">Input: 644 candidate routes (614 permit and timetable rows and 30 e-bus routes); threshold θ.</w:t>
-      </w:r>
-    </w:p>
-    <w:p>
-      <w:pPr>
-        <w:keepNext/>
-        <w:keepLines/>
-        <w:shd w:fill="F2F2F2" w:color="auto" w:val="clear"/>
-        <w:spacing w:after="40" w:before="0"/>
-        <w:ind w:left="360" w:right="360"/>
-      </w:pPr>
-      <w:r>
-        <w:rPr>
-          <w:b w:val="false"/>
-          <w:bCs w:val="false"/>
-          <w:sz w:val="22"/>
-          <w:szCs w:val="22"/>
-        </w:rPr>
-        <w:t xml:space="preserve">1. Group routes whose 80 m buffers overlap by at least θ.</w:t>
-      </w:r>
-    </w:p>
-    <w:p>
-      <w:pPr>
-        <w:keepNext/>
-        <w:keepLines/>
-        <w:shd w:fill="F2F2F2" w:color="auto" w:val="clear"/>
-        <w:spacing w:after="40" w:before="0"/>
-        <w:ind w:left="360" w:right="360"/>
-      </w:pPr>
-      <w:r>
-        <w:rPr>
-          <w:b w:val="false"/>
-          <w:bCs w:val="false"/>
-          <w:sz w:val="22"/>
-          <w:szCs w:val="22"/>
-        </w:rPr>
-        <w:t xml:space="preserve">2. In each group, take the route with the highest index as trunk if it is at least 5 km long and above the 30th percentile of the index.</w:t>
-      </w:r>
-    </w:p>
-    <w:p>
-      <w:pPr>
-        <w:keepNext/>
-        <w:keepLines/>
-        <w:shd w:fill="F2F2F2" w:color="auto" w:val="clear"/>
-        <w:spacing w:after="40" w:before="0"/>
-        <w:ind w:left="360" w:right="360"/>
-      </w:pPr>
-      <w:r>
-        <w:rPr>
-          <w:b w:val="false"/>
-          <w:bCs w:val="false"/>
-          <w:sz w:val="22"/>
-          <w:szCs w:val="22"/>
-        </w:rPr>
-        <w:t xml:space="preserve">3. Absorb a member into the trunk if φ ≥ θ and the two start points are within 2.5 km; otherwise keep the member as a feeder.</w:t>
-      </w:r>
-    </w:p>
-    <w:p>
-      <w:pPr>
-        <w:keepNext/>
-        <w:keepLines/>
-        <w:shd w:fill="F2F2F2" w:color="auto" w:val="clear"/>
-        <w:spacing w:after="40" w:before="0"/>
-        <w:ind w:left="360" w:right="360"/>
-      </w:pPr>
-      <w:r>
-        <w:rPr>
-          <w:b w:val="false"/>
-          <w:bCs w:val="false"/>
-          <w:sz w:val="22"/>
-          <w:szCs w:val="22"/>
-        </w:rPr>
-        <w:t xml:space="preserve">4. Never absorb an e-bus route, and never merge two members with each other.</w:t>
-      </w:r>
-    </w:p>
-    <w:p>
-      <w:pPr>
-        <w:keepNext/>
-        <w:keepLines/>
-        <w:shd w:fill="F2F2F2" w:color="auto" w:val="clear"/>
-        <w:spacing w:after="40" w:before="0"/>
-        <w:ind w:left="360" w:right="360"/>
-      </w:pPr>
-      <w:r>
-        <w:rPr>
-          <w:b w:val="false"/>
-          <w:bCs w:val="false"/>
-          <w:sz w:val="22"/>
-          <w:szCs w:val="22"/>
-        </w:rPr>
-        <w:t xml:space="preserve">5. Collapse routes on the same corridor, in either direction, into one service.</w:t>
-      </w:r>
-    </w:p>
-    <w:p>
-      <w:pPr>
-        <w:keepNext w:val="false"/>
-        <w:keepLines/>
-        <w:pBdr>
-          <w:bottom w:val="single" w:color="808080" w:sz="6" w:space="4"/>
-        </w:pBdr>
-        <w:shd w:fill="F2F2F2" w:color="auto" w:val="clear"/>
-        <w:spacing w:after="160" w:before="0"/>
-        <w:ind w:left="360" w:right="360"/>
-      </w:pPr>
-      <w:r>
-        <w:rPr>
-          <w:b w:val="false"/>
-          <w:bCs w:val="false"/>
-          <w:sz w:val="22"/>
-          <w:szCs w:val="22"/>
-        </w:rPr>
-        <w:t xml:space="preserve">Output: 186 active routes (32 trunks and 154 feeders); 458 routes absorbed.</w:t>
-      </w:r>
-    </w:p>
-    <w:p>
-      <w:pPr>
-        <w:jc w:val="both"/>
-      </w:pPr>
-      <w:r>
-        <w:t xml:space="preserve">The rule is conservative: the 186 active routes keep 156 of the 157 corridors. The merge rule is not sampled in the uncertainty analysis; scenario S4 in Section 5, which lowers θ to 0.50 and merges connected groups, is its only test.</w:t>
+        <w:t xml:space="preserve">Here ẑ</w:t>
+      </w:r>
+      <w:r>
+        <w:rPr>
+          <w:vertAlign w:val="subscript"/>
+        </w:rPr>
+        <w:t xml:space="preserve">Π</w:t>
+      </w:r>
+      <w:r>
+        <w:t xml:space="preserve"> and ẑ</w:t>
+      </w:r>
+      <w:r>
+        <w:rPr>
+          <w:vertAlign w:val="subscript"/>
+        </w:rPr>
+        <w:t xml:space="preserve">O</w:t>
+      </w:r>
+      <w:r>
+        <w:t xml:space="preserve"> are the rescaled values of Π</w:t>
+      </w:r>
+      <w:r>
+        <w:rPr>
+          <w:vertAlign w:val="superscript"/>
+        </w:rPr>
+        <w:t xml:space="preserve">*</w:t>
+      </w:r>
+      <w:r>
+        <w:t xml:space="preserve">(</w:t>
+      </w:r>
+      <w:r>
+        <w:rPr>
+          <w:i/>
+          <w:iCs/>
+        </w:rPr>
+        <w:t xml:space="preserve">r</w:t>
+      </w:r>
+      <w:r>
+        <w:t xml:space="preserve">)/ℓ(</w:t>
+      </w:r>
+      <w:r>
+        <w:rPr>
+          <w:i/>
+          <w:iCs/>
+        </w:rPr>
+        <w:t xml:space="preserve">r</w:t>
+      </w:r>
+      <w:r>
+        <w:t xml:space="preserve">) and </w:t>
+      </w:r>
+      <w:r>
+        <w:rPr>
+          <w:i/>
+          <w:iCs/>
+        </w:rPr>
+        <w:t xml:space="preserve">O</w:t>
+      </w:r>
+      <w:r>
+        <w:t xml:space="preserve">(</w:t>
+      </w:r>
+      <w:r>
+        <w:rPr>
+          <w:i/>
+          <w:iCs/>
+        </w:rPr>
+        <w:t xml:space="preserve">r</w:t>
+      </w:r>
+      <w:r>
+        <w:t xml:space="preserve">)/ℓ(</w:t>
+      </w:r>
+      <w:r>
+        <w:rPr>
+          <w:i/>
+          <w:iCs/>
+        </w:rPr>
+        <w:t xml:space="preserve">r</w:t>
+      </w:r>
+      <w:r>
+        <w:t xml:space="preserve">). The two components are strongly correlated (Pearson's </w:t>
+      </w:r>
+      <w:r>
+        <w:rPr>
+          <w:i/>
+          <w:iCs/>
+        </w:rPr>
+        <w:t xml:space="preserve">r</w:t>
+      </w:r>
+      <w:r>
+        <w:t xml:space="preserve"> = 0.89 with network catchments), so the index is close to a ranking by population density with a destination adjustment. Principal-component weights (Jolliffe, 2002) equal the equal weights when there are two components, so Section 5 compares equal weights with entropy weights (Shannon, 1948; Zou et al., 2006) and with β from 0.2 to 0.8. The index indicates where demand is likely to be; it does not measure demand.</w:t>
       </w:r>
     </w:p>
     <w:p>
@@ -2487,7 +2183,7 @@
         <w:keepNext/>
       </w:pPr>
       <w:r>
-        <w:t xml:space="preserve">4.7 Service tiers and headways</w:t>
+        <w:t xml:space="preserve">4.6 Merging overlapping routes</w:t>
       </w:r>
     </w:p>
     <w:p>
@@ -2495,33 +2191,27 @@
         <w:jc w:val="both"/>
       </w:pPr>
       <w:r>
-        <w:t xml:space="preserve">Each route is typed by length as urban (under 15 km), peri-urban (15 to 40 km) or regional (over 40 km), unless its permit category indicates otherwise. Active routes were divided into tiers by Jenks natural breaks on the index, which make each tier as internally uniform as possible (Fisher, 1958; Jenks, 1967). The goodness of variance fit measures how well </w:t>
-      </w:r>
-      <w:r>
-        <w:rPr>
-          <w:i/>
-          <w:iCs/>
-        </w:rPr>
-        <w:t xml:space="preserve">k</w:t>
-      </w:r>
-      <w:r>
-        <w:t xml:space="preserve"> tiers describe the index values </w:t>
-      </w:r>
-      <w:r>
-        <w:rPr>
-          <w:i/>
-          <w:iCs/>
-        </w:rPr>
-        <w:t xml:space="preserve">y</w:t>
-      </w:r>
-      <w:r>
-        <w:rPr>
-          <w:vertAlign w:val="subscript"/>
-        </w:rPr>
-        <w:t xml:space="preserve">i</w:t>
-      </w:r>
-      <w:r>
-        <w:t xml:space="preserve">:</w:t>
+        <w:t xml:space="preserve">Where several services share a road, the network should run one of them. Overlap between two routes is measured on 80 m buffers </w:t>
+      </w:r>
+      <w:r>
+        <w:rPr>
+          <w:i/>
+          <w:iCs/>
+        </w:rPr>
+        <w:t xml:space="preserve">S</w:t>
+      </w:r>
+      <w:r>
+        <w:t xml:space="preserve">(</w:t>
+      </w:r>
+      <w:r>
+        <w:rPr>
+          <w:i/>
+          <w:iCs/>
+        </w:rPr>
+        <w:t xml:space="preserve">r</w:t>
+      </w:r>
+      <w:r>
+        <w:t xml:space="preserve">) around their lines:</w:t>
       </w:r>
     </w:p>
     <w:tbl>
@@ -2563,9 +2253,9 @@
             <w:r>
               <w:drawing>
                 <wp:inline distT="0" distB="0" distL="0" distR="0">
-                  <wp:extent cx="3562350" cy="885825"/>
+                  <wp:extent cx="2219325" cy="457200"/>
                   <wp:effectExtent t="0" r="0" b="0" l="0"/>
-                  <wp:docPr id="10" name="eq9" descr="GVF(k) = 1 - \frac{\sum_{j=1}^{k}\;\;\sum_{i \in C_j} (y_i - \bar{y}_{C_j})^2}{\sum_i (y_i - \bar{y})^2}, \qquad k = 2, \ldots, 7" title="Equation 9"/>
+                  <wp:docPr id="9" name="eq8" descr="\phi(r_i, r_j) = \frac{|S(r_i) \cap S(r_j)|}{\min(|S(r_i)|,\ |S(r_j)|)}" title="Equation 8"/>
                   <wp:cNvGraphicFramePr>
                     <a:graphicFrameLocks xmlns:a="http://schemas.openxmlformats.org/drawingml/2006/main" noChangeAspect="1"/>
                   </wp:cNvGraphicFramePr>
@@ -2588,7 +2278,7 @@
                         <pic:spPr bwMode="auto">
                           <a:xfrm>
                             <a:off x="0" y="0"/>
-                            <a:ext cx="3562350" cy="885825"/>
+                            <a:ext cx="2219325" cy="457200"/>
                           </a:xfrm>
                           <a:prstGeom prst="rect">
                             <a:avLst/>
@@ -2619,7 +2309,7 @@
               <w:jc w:val="right"/>
             </w:pPr>
             <w:r>
-              <w:t xml:space="preserve">(9)</w:t>
+              <w:t xml:space="preserve">(8)</w:t>
             </w:r>
           </w:p>
         </w:tc>
@@ -2630,7 +2320,157 @@
         <w:jc w:val="both"/>
       </w:pPr>
       <w:r>
-        <w:t xml:space="preserve">The plan uses three tiers, which give a fit of 0.90 against 0.79 for two; three is thus the smallest number of tiers above 0.80, a threshold of our choosing and not a published standard. Published tiers carry three overrides: e-bus routes are always in the top tier, routes within 250 m of 11 listed social destinations (four migrant townships and seven hospitals) rise from the lowest tier to the middle one, and a route lying close to a tier break, within 5% of the gap between the two breaks, can move one tier according to its road role.</w:t>
+        <w:t xml:space="preserve">A trunk is the highest-ranked route of its overlap group, and a member joins it only when φ ≥ θ = 0.65 and their start points lie within 2.5 km; members are never merged with each other and e-bus routes are never absorbed (Algorithm 1). The buffer, θ and the 2.5 km tolerance are our assumptions.</w:t>
+      </w:r>
+    </w:p>
+    <w:p>
+      <w:pPr>
+        <w:keepNext/>
+        <w:keepLines/>
+        <w:pBdr>
+          <w:top w:val="single" w:color="808080" w:sz="6" w:space="4"/>
+        </w:pBdr>
+        <w:shd w:fill="F2F2F2" w:color="auto" w:val="clear"/>
+        <w:spacing w:after="40" w:before="120"/>
+        <w:ind w:left="360" w:right="360"/>
+      </w:pPr>
+      <w:r>
+        <w:rPr>
+          <w:b/>
+          <w:bCs/>
+          <w:sz w:val="22"/>
+          <w:szCs w:val="22"/>
+        </w:rPr>
+        <w:t xml:space="preserve">Algorithm 1. Merging overlapping routes</w:t>
+      </w:r>
+    </w:p>
+    <w:p>
+      <w:pPr>
+        <w:keepNext/>
+        <w:keepLines/>
+        <w:shd w:fill="F2F2F2" w:color="auto" w:val="clear"/>
+        <w:spacing w:after="40" w:before="0"/>
+        <w:ind w:left="360" w:right="360"/>
+      </w:pPr>
+      <w:r>
+        <w:rPr>
+          <w:b w:val="false"/>
+          <w:bCs w:val="false"/>
+          <w:sz w:val="22"/>
+          <w:szCs w:val="22"/>
+        </w:rPr>
+        <w:t xml:space="preserve">Input: 644 candidate routes (614 permit and timetable rows and 30 e-bus routes); threshold θ.</w:t>
+      </w:r>
+    </w:p>
+    <w:p>
+      <w:pPr>
+        <w:keepNext/>
+        <w:keepLines/>
+        <w:shd w:fill="F2F2F2" w:color="auto" w:val="clear"/>
+        <w:spacing w:after="40" w:before="0"/>
+        <w:ind w:left="360" w:right="360"/>
+      </w:pPr>
+      <w:r>
+        <w:rPr>
+          <w:b w:val="false"/>
+          <w:bCs w:val="false"/>
+          <w:sz w:val="22"/>
+          <w:szCs w:val="22"/>
+        </w:rPr>
+        <w:t xml:space="preserve">1. Group routes whose 80 m buffers overlap by at least θ.</w:t>
+      </w:r>
+    </w:p>
+    <w:p>
+      <w:pPr>
+        <w:keepNext/>
+        <w:keepLines/>
+        <w:shd w:fill="F2F2F2" w:color="auto" w:val="clear"/>
+        <w:spacing w:after="40" w:before="0"/>
+        <w:ind w:left="360" w:right="360"/>
+      </w:pPr>
+      <w:r>
+        <w:rPr>
+          <w:b w:val="false"/>
+          <w:bCs w:val="false"/>
+          <w:sz w:val="22"/>
+          <w:szCs w:val="22"/>
+        </w:rPr>
+        <w:t xml:space="preserve">2. In each group, take the route with the highest index as trunk if it is at least 5 km long and above the 30th percentile of the index.</w:t>
+      </w:r>
+    </w:p>
+    <w:p>
+      <w:pPr>
+        <w:keepNext/>
+        <w:keepLines/>
+        <w:shd w:fill="F2F2F2" w:color="auto" w:val="clear"/>
+        <w:spacing w:after="40" w:before="0"/>
+        <w:ind w:left="360" w:right="360"/>
+      </w:pPr>
+      <w:r>
+        <w:rPr>
+          <w:b w:val="false"/>
+          <w:bCs w:val="false"/>
+          <w:sz w:val="22"/>
+          <w:szCs w:val="22"/>
+        </w:rPr>
+        <w:t xml:space="preserve">3. Absorb a member into the trunk if φ ≥ θ and the two start points are within 2.5 km; otherwise keep the member as a feeder.</w:t>
+      </w:r>
+    </w:p>
+    <w:p>
+      <w:pPr>
+        <w:keepNext/>
+        <w:keepLines/>
+        <w:shd w:fill="F2F2F2" w:color="auto" w:val="clear"/>
+        <w:spacing w:after="40" w:before="0"/>
+        <w:ind w:left="360" w:right="360"/>
+      </w:pPr>
+      <w:r>
+        <w:rPr>
+          <w:b w:val="false"/>
+          <w:bCs w:val="false"/>
+          <w:sz w:val="22"/>
+          <w:szCs w:val="22"/>
+        </w:rPr>
+        <w:t xml:space="preserve">4. Never absorb an e-bus route, and never merge two members with each other.</w:t>
+      </w:r>
+    </w:p>
+    <w:p>
+      <w:pPr>
+        <w:keepNext/>
+        <w:keepLines/>
+        <w:shd w:fill="F2F2F2" w:color="auto" w:val="clear"/>
+        <w:spacing w:after="40" w:before="0"/>
+        <w:ind w:left="360" w:right="360"/>
+      </w:pPr>
+      <w:r>
+        <w:rPr>
+          <w:b w:val="false"/>
+          <w:bCs w:val="false"/>
+          <w:sz w:val="22"/>
+          <w:szCs w:val="22"/>
+        </w:rPr>
+        <w:t xml:space="preserve">5. Collapse routes on the same corridor, in either direction, into one service.</w:t>
+      </w:r>
+    </w:p>
+    <w:p>
+      <w:pPr>
+        <w:keepNext w:val="false"/>
+        <w:keepLines/>
+        <w:pBdr>
+          <w:bottom w:val="single" w:color="808080" w:sz="6" w:space="4"/>
+        </w:pBdr>
+        <w:shd w:fill="F2F2F2" w:color="auto" w:val="clear"/>
+        <w:spacing w:after="160" w:before="0"/>
+        <w:ind w:left="360" w:right="360"/>
+      </w:pPr>
+      <w:r>
+        <w:rPr>
+          <w:b w:val="false"/>
+          <w:bCs w:val="false"/>
+          <w:sz w:val="22"/>
+          <w:szCs w:val="22"/>
+        </w:rPr>
+        <w:t xml:space="preserve">Output: 186 active routes (32 trunks and 154 feeders); 458 routes absorbed.</w:t>
       </w:r>
     </w:p>
     <w:p>
@@ -2638,7 +2478,7 @@
         <w:jc w:val="both"/>
       </w:pPr>
       <w:r>
-        <w:t xml:space="preserve">Headways are service standards, set independently of the index. E-bus routes run every 15 minutes, the operator's headway, other top-tier routes every 20 minutes and all other urban and peri-urban routes every 35 minutes. On regional routes outside the e-bus network, the headway starts at 35 minutes and, when the estimated load of Section 4.9 is below a target of 55%, is lengthened in proportion and rounded to 40, 45 or 50 minutes. In the published plan, 62 of these 67 routes run at 50 minutes and 5 at 35, so the rule acts in practice as a 50-minute maximum wait. Standards of this kind pursue what Walker (2008) calls a coverage goal, spreading service across an area whatever its ridership. Each route has one headway for the whole day.</w:t>
+        <w:t xml:space="preserve">The rule is conservative: the 186 active routes keep 156 of the 157 corridors. The merge rule is not sampled in the uncertainty analysis; scenario S4 in Section 5, which lowers θ to 0.50 and merges connected groups, is its only test.</w:t>
       </w:r>
     </w:p>
     <w:p>
@@ -2647,7 +2487,7 @@
         <w:keepNext/>
       </w:pPr>
       <w:r>
-        <w:t xml:space="preserve">4.8 Cycle time and fleet</w:t>
+        <w:t xml:space="preserve">4.7 Service tiers and headways</w:t>
       </w:r>
     </w:p>
     <w:p>
@@ -2655,7 +2495,33 @@
         <w:jc w:val="both"/>
       </w:pPr>
       <w:r>
-        <w:t xml:space="preserve">One-way running time is the free-flow road time, scaled for congestion, plus time lost at stops (Vuchic, 2005; Ceder, 2007):</w:t>
+        <w:t xml:space="preserve">Each route is typed by length as urban (under 15 km), peri-urban (15 to 40 km) or regional (over 40 km), unless its permit category indicates otherwise. Active routes were divided into tiers by Jenks natural breaks on the index, which make each tier as internally uniform as possible (Fisher, 1958; Jenks, 1967). The goodness of variance fit measures how well </w:t>
+      </w:r>
+      <w:r>
+        <w:rPr>
+          <w:i/>
+          <w:iCs/>
+        </w:rPr>
+        <w:t xml:space="preserve">k</w:t>
+      </w:r>
+      <w:r>
+        <w:t xml:space="preserve"> tiers describe the index values </w:t>
+      </w:r>
+      <w:r>
+        <w:rPr>
+          <w:i/>
+          <w:iCs/>
+        </w:rPr>
+        <w:t xml:space="preserve">y</w:t>
+      </w:r>
+      <w:r>
+        <w:rPr>
+          <w:vertAlign w:val="subscript"/>
+        </w:rPr>
+        <w:t xml:space="preserve">i</w:t>
+      </w:r>
+      <w:r>
+        <w:t xml:space="preserve">:</w:t>
       </w:r>
     </w:p>
     <w:tbl>
@@ -2697,9 +2563,9 @@
             <w:r>
               <w:drawing>
                 <wp:inline distT="0" distB="0" distL="0" distR="0">
-                  <wp:extent cx="2647950" cy="400050"/>
+                  <wp:extent cx="3562350" cy="885825"/>
                   <wp:effectExtent t="0" r="0" b="0" l="0"/>
-                  <wp:docPr id="11" name="eq10" descr="t_{run}(r) = \chi(r)\left(t_{free}(r) + J(r)\right) + \delta\, \frac{\ell(r)}{\Delta}" title="Equation 10"/>
+                  <wp:docPr id="10" name="eq9" descr="GVF(k) = 1 - \frac{\sum_{j=1}^{k}\;\;\sum_{i \in C_j} (y_i - \bar{y}_{C_j})^2}{\sum_i (y_i - \bar{y})^2}, \qquad k = 2, \ldots, 7" title="Equation 9"/>
                   <wp:cNvGraphicFramePr>
                     <a:graphicFrameLocks xmlns:a="http://schemas.openxmlformats.org/drawingml/2006/main" noChangeAspect="1"/>
                   </wp:cNvGraphicFramePr>
@@ -2722,7 +2588,7 @@
                         <pic:spPr bwMode="auto">
                           <a:xfrm>
                             <a:off x="0" y="0"/>
-                            <a:ext cx="2647950" cy="400050"/>
+                            <a:ext cx="3562350" cy="885825"/>
                           </a:xfrm>
                           <a:prstGeom prst="rect">
                             <a:avLst/>
@@ -2753,7 +2619,7 @@
               <w:jc w:val="right"/>
             </w:pPr>
             <w:r>
-              <w:t xml:space="preserve">(10)</w:t>
+              <w:t xml:space="preserve">(9)</w:t>
             </w:r>
           </w:p>
         </w:tc>
@@ -2764,37 +2630,32 @@
         <w:jc w:val="both"/>
       </w:pPr>
       <w:r>
-        <w:t xml:space="preserve">Here χ(</w:t>
-      </w:r>
-      <w:r>
-        <w:rPr>
-          <w:i/>
-          <w:iCs/>
-        </w:rPr>
-        <w:t xml:space="preserve">r</w:t>
-      </w:r>
-      <w:r>
-        <w:t xml:space="preserve">) is 2.2 for routes in the zone treated as the city core and 1.4 elsewhere; the core is bounded by a single line of latitude and contains 170 of the 186 routes. </w:t>
-      </w:r>
-      <w:r>
-        <w:rPr>
-          <w:i/>
-          <w:iCs/>
-        </w:rPr>
-        <w:t xml:space="preserve">J</w:t>
-      </w:r>
-      <w:r>
-        <w:t xml:space="preserve">(</w:t>
-      </w:r>
-      <w:r>
-        <w:rPr>
-          <w:i/>
-          <w:iCs/>
-        </w:rPr>
-        <w:t xml:space="preserve">r</w:t>
-      </w:r>
-      <w:r>
-        <w:t xml:space="preserve">) adds 8 minutes to routes that cross the Jhelum, and each stop costs δ = 0.5 minutes at a spacing of Δ = 500 m. These values are assumptions. Cycle time is the round trip with layover, capped per kilometre:</w:t>
+        <w:t xml:space="preserve">The plan uses three tiers, which give a fit of 0.90 against 0.79 for two; three is thus the smallest number of tiers above 0.80, a threshold of our choosing and not a published standard. Published tiers carry three overrides: e-bus routes are always in the top tier, routes within 250 m of 11 listed social destinations (four migrant townships and seven hospitals) rise from the lowest tier to the middle one, and a route lying close to a tier break, within 5% of the gap between the two breaks, can move one tier according to its road role.</w:t>
+      </w:r>
+    </w:p>
+    <w:p>
+      <w:pPr>
+        <w:jc w:val="both"/>
+      </w:pPr>
+      <w:r>
+        <w:t xml:space="preserve">Headways are service standards, set independently of the index. E-bus routes run every 15 minutes, the operator's headway, other top-tier routes every 20 minutes and all other urban and peri-urban routes every 35 minutes. On regional routes outside the e-bus network, the headway starts at 35 minutes and, when the estimated load of Section 4.9 is below a target of 55%, is lengthened in proportion and rounded to 40, 45 or 50 minutes. In the published plan, 62 of these 67 routes run at 50 minutes and 5 at 35, so the rule acts in practice as a 50-minute maximum wait. Standards of this kind pursue what Walker (2008) calls a coverage goal, spreading service across an area whatever its ridership. Each route has one headway for the whole day.</w:t>
+      </w:r>
+    </w:p>
+    <w:p>
+      <w:pPr>
+        <w:pStyle w:val="Heading2"/>
+        <w:keepNext/>
+      </w:pPr>
+      <w:r>
+        <w:t xml:space="preserve">4.8 Cycle time and fleet</w:t>
+      </w:r>
+    </w:p>
+    <w:p>
+      <w:pPr>
+        <w:jc w:val="both"/>
+      </w:pPr>
+      <w:r>
+        <w:t xml:space="preserve">One-way running time is the free-flow road time, scaled for congestion, plus time lost at stops (Vuchic, 2005; Ceder, 2007):</w:t>
       </w:r>
     </w:p>
     <w:tbl>
@@ -2836,9 +2697,9 @@
             <w:r>
               <w:drawing>
                 <wp:inline distT="0" distB="0" distL="0" distR="0">
-                  <wp:extent cx="2895600" cy="219075"/>
+                  <wp:extent cx="2647950" cy="400050"/>
                   <wp:effectExtent t="0" r="0" b="0" l="0"/>
-                  <wp:docPr id="12" name="eq11" descr="t_{cyc}(r) = \min\left(2 \lambda\, t_{run}(r),\ 2\, \ell(r)\, \omega_{type(r)}\right)" title="Equation 11"/>
+                  <wp:docPr id="11" name="eq10" descr="t_{run}(r) = \chi(r)\left(t_{free}(r) + J(r)\right) + \delta\, \frac{\ell(r)}{\Delta}" title="Equation 10"/>
                   <wp:cNvGraphicFramePr>
                     <a:graphicFrameLocks xmlns:a="http://schemas.openxmlformats.org/drawingml/2006/main" noChangeAspect="1"/>
                   </wp:cNvGraphicFramePr>
@@ -2861,7 +2722,7 @@
                         <pic:spPr bwMode="auto">
                           <a:xfrm>
                             <a:off x="0" y="0"/>
-                            <a:ext cx="2895600" cy="219075"/>
+                            <a:ext cx="2647950" cy="400050"/>
                           </a:xfrm>
                           <a:prstGeom prst="rect">
                             <a:avLst/>
@@ -2892,7 +2753,7 @@
               <w:jc w:val="right"/>
             </w:pPr>
             <w:r>
-              <w:t xml:space="preserve">(11)</w:t>
+              <w:t xml:space="preserve">(10)</w:t>
             </w:r>
           </w:p>
         </w:tc>
@@ -2903,14 +2764,24 @@
         <w:jc w:val="both"/>
       </w:pPr>
       <w:r>
-        <w:t xml:space="preserve">Here λ = 1.10 allows 10% of running time for layover, and ω is 4.0, 2.5 and 1.5 minutes per kilometre on urban, peri-urban and regional routes. The cap was meant to catch implausible values, but it binds on 169 of the 186 routes, and on those Eq. (10) has no effect on the fleet. The urban cap is also faster than the median pace observed in driver GPS, 4.62 minutes per kilometre, which is why Section 4.11 sizes the fleet a second time from observed pace. With headway </w:t>
-      </w:r>
-      <w:r>
-        <w:rPr>
-          <w:i/>
-          <w:iCs/>
-        </w:rPr>
-        <w:t xml:space="preserve">h</w:t>
+        <w:t xml:space="preserve">Here χ(</w:t>
+      </w:r>
+      <w:r>
+        <w:rPr>
+          <w:i/>
+          <w:iCs/>
+        </w:rPr>
+        <w:t xml:space="preserve">r</w:t>
+      </w:r>
+      <w:r>
+        <w:t xml:space="preserve">) is 2.2 for routes in the zone treated as the city core and 1.4 elsewhere; the core is bounded by a single line of latitude and contains 170 of the 186 routes. </w:t>
+      </w:r>
+      <w:r>
+        <w:rPr>
+          <w:i/>
+          <w:iCs/>
+        </w:rPr>
+        <w:t xml:space="preserve">J</w:t>
       </w:r>
       <w:r>
         <w:t xml:space="preserve">(</w:t>
@@ -2923,17 +2794,7 @@
         <w:t xml:space="preserve">r</w:t>
       </w:r>
       <w:r>
-        <w:t xml:space="preserve">), the fleet on route </w:t>
-      </w:r>
-      <w:r>
-        <w:rPr>
-          <w:i/>
-          <w:iCs/>
-        </w:rPr>
-        <w:t xml:space="preserve">r</w:t>
-      </w:r>
-      <w:r>
-        <w:t xml:space="preserve"> is</w:t>
+        <w:t xml:space="preserve">) adds 8 minutes to routes that cross the Jhelum, and each stop costs δ = 0.5 minutes at a spacing of Δ = 500 m. These values are assumptions. Cycle time is the round trip with layover, capped per kilometre:</w:t>
       </w:r>
     </w:p>
     <w:tbl>
@@ -2975,9 +2836,9 @@
             <w:r>
               <w:drawing>
                 <wp:inline distT="0" distB="0" distL="0" distR="0">
-                  <wp:extent cx="4095750" cy="438150"/>
+                  <wp:extent cx="2895600" cy="219075"/>
                   <wp:effectExtent t="0" r="0" b="0" l="0"/>
-                  <wp:docPr id="13" name="eq12" descr="N_{op}(r) = \left\lceil \frac{t_{cyc}(r)}{h(r)} \right\rceil, \qquad N(r) = \max\left(\lceil \sigma N_{op}(r) \rceil,\ N^{min}_{type(r)}\right)" title="Equation 12"/>
+                  <wp:docPr id="12" name="eq11" descr="t_{cyc}(r) = \min\left(2 \lambda\, t_{run}(r),\ 2\, \ell(r)\, \omega_{type(r)}\right)" title="Equation 11"/>
                   <wp:cNvGraphicFramePr>
                     <a:graphicFrameLocks xmlns:a="http://schemas.openxmlformats.org/drawingml/2006/main" noChangeAspect="1"/>
                   </wp:cNvGraphicFramePr>
@@ -3000,7 +2861,7 @@
                         <pic:spPr bwMode="auto">
                           <a:xfrm>
                             <a:off x="0" y="0"/>
-                            <a:ext cx="4095750" cy="438150"/>
+                            <a:ext cx="2895600" cy="219075"/>
                           </a:xfrm>
                           <a:prstGeom prst="rect">
                             <a:avLst/>
@@ -3031,7 +2892,7 @@
               <w:jc w:val="right"/>
             </w:pPr>
             <w:r>
-              <w:t xml:space="preserve">(12)</w:t>
+              <w:t xml:space="preserve">(11)</w:t>
             </w:r>
           </w:p>
         </w:tc>
@@ -3042,46 +2903,14 @@
         <w:jc w:val="both"/>
       </w:pPr>
       <w:r>
-        <w:t xml:space="preserve">where the spare allowance σ = 1.15 is an assumption and </w:t>
-      </w:r>
-      <w:r>
-        <w:rPr>
-          <w:i/>
-          <w:iCs/>
-        </w:rPr>
-        <w:t xml:space="preserve">N</w:t>
-      </w:r>
-      <w:r>
-        <w:rPr>
-          <w:vertAlign w:val="superscript"/>
-        </w:rPr>
-        <w:t xml:space="preserve">min</w:t>
-      </w:r>
-      <w:r>
-        <w:t xml:space="preserve"> is two buses on urban and peri-urban routes and one on regional routes. On the e-bus routes, the set </w:t>
-      </w:r>
-      <w:r>
-        <w:rPr>
-          <w:i/>
-          <w:iCs/>
-        </w:rPr>
-        <w:t xml:space="preserve">E</w:t>
-      </w:r>
-      <w:r>
-        <w:t xml:space="preserve">, the operator's deployed fleet </w:t>
-      </w:r>
-      <w:r>
-        <w:rPr>
-          <w:i/>
-          <w:iCs/>
-        </w:rPr>
-        <w:t xml:space="preserve">N</w:t>
-      </w:r>
-      <w:r>
-        <w:rPr>
-          <w:vertAlign w:val="superscript"/>
-        </w:rPr>
-        <w:t xml:space="preserve">emp</w:t>
+        <w:t xml:space="preserve">Here λ = 1.10 allows 10% of running time for layover, and ω is 4.0, 2.5 and 1.5 minutes per kilometre on urban, peri-urban and regional routes. The cap was meant to catch implausible values, but it binds on 169 of the 186 routes, and on those Eq. (10) has no effect on the fleet. The urban cap is also faster than the median pace observed in driver GPS, 4.62 minutes per kilometre, which is why Section 4.11 sizes the fleet a second time from observed pace. With headway </w:t>
+      </w:r>
+      <w:r>
+        <w:rPr>
+          <w:i/>
+          <w:iCs/>
+        </w:rPr>
+        <w:t xml:space="preserve">h</w:t>
       </w:r>
       <w:r>
         <w:t xml:space="preserve">(</w:t>
@@ -3094,7 +2923,17 @@
         <w:t xml:space="preserve">r</w:t>
       </w:r>
       <w:r>
-        <w:t xml:space="preserve">) is a floor, and the network total is</w:t>
+        <w:t xml:space="preserve">), the fleet on route </w:t>
+      </w:r>
+      <w:r>
+        <w:rPr>
+          <w:i/>
+          <w:iCs/>
+        </w:rPr>
+        <w:t xml:space="preserve">r</w:t>
+      </w:r>
+      <w:r>
+        <w:t xml:space="preserve"> is</w:t>
       </w:r>
     </w:p>
     <w:tbl>
@@ -3136,9 +2975,9 @@
             <w:r>
               <w:drawing>
                 <wp:inline distT="0" distB="0" distL="0" distR="0">
-                  <wp:extent cx="4791075" cy="381000"/>
+                  <wp:extent cx="4095750" cy="438150"/>
                   <wp:effectExtent t="0" r="0" b="0" l="0"/>
-                  <wp:docPr id="14" name="eq13" descr="N_{total} = \sum_{r \notin E} N(r) + \sum_{r \in E} \max\left(N(r),\ N^{emp}(r)\right) = 728 + 283 = 1{,}011" title="Equation 13"/>
+                  <wp:docPr id="13" name="eq12" descr="N_{op}(r) = \left\lceil \frac{t_{cyc}(r)}{h(r)} \right\rceil, \qquad N(r) = \max\left(\lceil \sigma N_{op}(r) \rceil,\ N^{min}_{type(r)}\right)" title="Equation 12"/>
                   <wp:cNvGraphicFramePr>
                     <a:graphicFrameLocks xmlns:a="http://schemas.openxmlformats.org/drawingml/2006/main" noChangeAspect="1"/>
                   </wp:cNvGraphicFramePr>
@@ -3161,7 +3000,7 @@
                         <pic:spPr bwMode="auto">
                           <a:xfrm>
                             <a:off x="0" y="0"/>
-                            <a:ext cx="4791075" cy="381000"/>
+                            <a:ext cx="4095750" cy="438150"/>
                           </a:xfrm>
                           <a:prstGeom prst="rect">
                             <a:avLst/>
@@ -3192,7 +3031,7 @@
               <w:jc w:val="right"/>
             </w:pPr>
             <w:r>
-              <w:t xml:space="preserve">(13)</w:t>
+              <w:t xml:space="preserve">(12)</w:t>
             </w:r>
           </w:p>
         </w:tc>
@@ -3203,92 +3042,49 @@
         <w:jc w:val="both"/>
       </w:pPr>
       <w:r>
-        <w:t xml:space="preserve">Of the buses, 187 are heavy (about 12 m), 754 medium (about 9 m) and 70 light (minibus): routes under 12 km get no heavy buses, heavy buses are at most half the fleet of longer routes, and e-bus routes keep the operator's split. An independent re-implementation of Eqs. (10) to (12) reproduces the published fleet on all 186 routes when given the plan's headways, its five GPS-timed cycle times (Section 4.10) and the e-bus floors.</w:t>
-      </w:r>
-    </w:p>
-    <w:p>
-      <w:pPr>
-        <w:pStyle w:val="Heading2"/>
-        <w:keepNext/>
-      </w:pPr>
-      <w:r>
-        <w:t xml:space="preserve">4.9 Where the e-bus operator's figures enter</w:t>
-      </w:r>
-    </w:p>
-    <w:p>
-      <w:pPr>
-        <w:jc w:val="both"/>
-      </w:pPr>
-      <w:r>
-        <w:t xml:space="preserve">The method needs no observed demand for the routes it plans, but it uses the e-bus operator's figures where they exist, at five points:</w:t>
-      </w:r>
-    </w:p>
-    <w:p>
-      <w:pPr>
-        <w:pStyle w:val="ListParagraph"/>
-        <w:numPr>
-          <w:ilvl w:val="0"/>
-          <w:numId w:val="2"/>
-        </w:numPr>
-      </w:pPr>
-      <w:r>
-        <w:t xml:space="preserve">The 30 e-bus routes are added as they run and are never absorbed (Section 4.6).</w:t>
-      </w:r>
-    </w:p>
-    <w:p>
-      <w:pPr>
-        <w:pStyle w:val="ListParagraph"/>
-        <w:numPr>
-          <w:ilvl w:val="0"/>
-          <w:numId w:val="2"/>
-        </w:numPr>
-      </w:pPr>
-      <w:r>
-        <w:t xml:space="preserve">They sit in the top tier and run every 15 minutes, whatever their index (Section 4.7).</w:t>
-      </w:r>
-    </w:p>
-    <w:p>
-      <w:pPr>
-        <w:pStyle w:val="ListParagraph"/>
-        <w:numPr>
-          <w:ilvl w:val="0"/>
-          <w:numId w:val="2"/>
-        </w:numPr>
-      </w:pPr>
-      <w:r>
-        <w:t xml:space="preserve">Their fleet is at least the operator's deployed fleet (Eq. 13).</w:t>
-      </w:r>
-    </w:p>
-    <w:p>
-      <w:pPr>
-        <w:pStyle w:val="ListParagraph"/>
-        <w:numPr>
-          <w:ilvl w:val="0"/>
-          <w:numId w:val="2"/>
-        </w:numPr>
-      </w:pPr>
-      <w:r>
-        <w:t xml:space="preserve">The urban bus share and the scale of the ridership estimate below are set from the operator's boardings.</w:t>
-      </w:r>
-    </w:p>
-    <w:p>
-      <w:pPr>
-        <w:pStyle w:val="ListParagraph"/>
-        <w:numPr>
-          <w:ilvl w:val="0"/>
-          <w:numId w:val="2"/>
-        </w:numPr>
-      </w:pPr>
-      <w:r>
-        <w:t xml:space="preserve">On the 67 regional routes outside the e-bus network, that estimate can lengthen the headway (Section 4.7).</w:t>
-      </w:r>
-    </w:p>
-    <w:p>
-      <w:pPr>
-        <w:jc w:val="both"/>
-      </w:pPr>
-      <w:r>
-        <w:t xml:space="preserve">The estimate sets these regional headways and the load factors and demand-sized fleet of Section 5, but not the route set or the tiers. For route </w:t>
+        <w:t xml:space="preserve">where the spare allowance σ = 1.15 is an assumption and </w:t>
+      </w:r>
+      <w:r>
+        <w:rPr>
+          <w:i/>
+          <w:iCs/>
+        </w:rPr>
+        <w:t xml:space="preserve">N</w:t>
+      </w:r>
+      <w:r>
+        <w:rPr>
+          <w:vertAlign w:val="superscript"/>
+        </w:rPr>
+        <w:t xml:space="preserve">min</w:t>
+      </w:r>
+      <w:r>
+        <w:t xml:space="preserve"> is two buses on urban and peri-urban routes and one on regional routes. On the e-bus routes, the set </w:t>
+      </w:r>
+      <w:r>
+        <w:rPr>
+          <w:i/>
+          <w:iCs/>
+        </w:rPr>
+        <w:t xml:space="preserve">E</w:t>
+      </w:r>
+      <w:r>
+        <w:t xml:space="preserve">, the operator's deployed fleet </w:t>
+      </w:r>
+      <w:r>
+        <w:rPr>
+          <w:i/>
+          <w:iCs/>
+        </w:rPr>
+        <w:t xml:space="preserve">N</w:t>
+      </w:r>
+      <w:r>
+        <w:rPr>
+          <w:vertAlign w:val="superscript"/>
+        </w:rPr>
+        <w:t xml:space="preserve">emp</w:t>
+      </w:r>
+      <w:r>
+        <w:t xml:space="preserve">(</w:t>
       </w:r>
       <w:r>
         <w:rPr>
@@ -3298,7 +3094,7 @@
         <w:t xml:space="preserve">r</w:t>
       </w:r>
       <w:r>
-        <w:t xml:space="preserve"> it is</w:t>
+        <w:t xml:space="preserve">) is a floor, and the network total is</w:t>
       </w:r>
     </w:p>
     <w:tbl>
@@ -3340,9 +3136,9 @@
             <w:r>
               <w:drawing>
                 <wp:inline distT="0" distB="0" distL="0" distR="0">
-                  <wp:extent cx="3190875" cy="381000"/>
+                  <wp:extent cx="4791075" cy="381000"/>
                   <wp:effectExtent t="0" r="0" b="0" l="0"/>
-                  <wp:docPr id="15" name="eq14" descr="\tilde{D}(r) = \kappa\, g\, m_{type(r)}\, s(r) \sum_{c \in A(r)} \rho_c, \qquad \kappa = 0.33" title="Equation 14"/>
+                  <wp:docPr id="14" name="eq13" descr="N_{total} = \sum_{r \notin E} N(r) + \sum_{r \in E} \max\left(N(r),\ N^{emp}(r)\right) = 728 + 283 = 1{,}011" title="Equation 13"/>
                   <wp:cNvGraphicFramePr>
                     <a:graphicFrameLocks xmlns:a="http://schemas.openxmlformats.org/drawingml/2006/main" noChangeAspect="1"/>
                   </wp:cNvGraphicFramePr>
@@ -3365,6 +3161,210 @@
                         <pic:spPr bwMode="auto">
                           <a:xfrm>
                             <a:off x="0" y="0"/>
+                            <a:ext cx="4791075" cy="381000"/>
+                          </a:xfrm>
+                          <a:prstGeom prst="rect">
+                            <a:avLst/>
+                          </a:prstGeom>
+                        </pic:spPr>
+                      </pic:pic>
+                    </a:graphicData>
+                  </a:graphic>
+                </wp:inline>
+              </w:drawing>
+            </w:r>
+          </w:p>
+        </w:tc>
+        <w:tc>
+          <w:tcPr>
+            <w:tcW w:type="dxa" w:w="700"/>
+            <w:tcBorders>
+              <w:top w:val="none" w:color="FFFFFF" w:sz="0"/>
+              <w:left w:val="none" w:color="FFFFFF" w:sz="0"/>
+              <w:bottom w:val="none" w:color="FFFFFF" w:sz="0"/>
+              <w:right w:val="none" w:color="FFFFFF" w:sz="0"/>
+            </w:tcBorders>
+            <w:vAlign w:val="center"/>
+          </w:tcPr>
+          <w:p>
+            <w:pPr>
+              <w:spacing w:after="100" w:before="100"/>
+              <w:jc w:val="right"/>
+            </w:pPr>
+            <w:r>
+              <w:t xml:space="preserve">(13)</w:t>
+            </w:r>
+          </w:p>
+        </w:tc>
+      </w:tr>
+    </w:tbl>
+    <w:p>
+      <w:pPr>
+        <w:jc w:val="both"/>
+      </w:pPr>
+      <w:r>
+        <w:t xml:space="preserve">Of the buses, 187 are heavy (about 12 m), 754 medium (about 9 m) and 70 light (minibus): routes under 12 km get no heavy buses, heavy buses are at most half the fleet of longer routes, and e-bus routes keep the operator's split. An independent re-implementation of Eqs. (10) to (12) reproduces the published fleet on all 186 routes when given the plan's headways, its five GPS-timed cycle times (Section 4.10) and the e-bus floors.</w:t>
+      </w:r>
+    </w:p>
+    <w:p>
+      <w:pPr>
+        <w:pStyle w:val="Heading2"/>
+        <w:keepNext/>
+      </w:pPr>
+      <w:r>
+        <w:t xml:space="preserve">4.9 Where the e-bus operator's figures enter</w:t>
+      </w:r>
+    </w:p>
+    <w:p>
+      <w:pPr>
+        <w:jc w:val="both"/>
+      </w:pPr>
+      <w:r>
+        <w:t xml:space="preserve">The method needs no observed demand for the routes it plans, but it uses the e-bus operator's figures where they exist, at five points:</w:t>
+      </w:r>
+    </w:p>
+    <w:p>
+      <w:pPr>
+        <w:pStyle w:val="ListParagraph"/>
+        <w:numPr>
+          <w:ilvl w:val="0"/>
+          <w:numId w:val="2"/>
+        </w:numPr>
+      </w:pPr>
+      <w:r>
+        <w:t xml:space="preserve">The 30 e-bus routes are added as they run and are never absorbed (Section 4.6).</w:t>
+      </w:r>
+    </w:p>
+    <w:p>
+      <w:pPr>
+        <w:pStyle w:val="ListParagraph"/>
+        <w:numPr>
+          <w:ilvl w:val="0"/>
+          <w:numId w:val="2"/>
+        </w:numPr>
+      </w:pPr>
+      <w:r>
+        <w:t xml:space="preserve">They sit in the top tier and run every 15 minutes, whatever their index (Section 4.7).</w:t>
+      </w:r>
+    </w:p>
+    <w:p>
+      <w:pPr>
+        <w:pStyle w:val="ListParagraph"/>
+        <w:numPr>
+          <w:ilvl w:val="0"/>
+          <w:numId w:val="2"/>
+        </w:numPr>
+      </w:pPr>
+      <w:r>
+        <w:t xml:space="preserve">Their fleet is at least the operator's deployed fleet (Eq. 13).</w:t>
+      </w:r>
+    </w:p>
+    <w:p>
+      <w:pPr>
+        <w:pStyle w:val="ListParagraph"/>
+        <w:numPr>
+          <w:ilvl w:val="0"/>
+          <w:numId w:val="2"/>
+        </w:numPr>
+      </w:pPr>
+      <w:r>
+        <w:t xml:space="preserve">The urban bus share and the scale of the ridership estimate below are set from the operator's boardings.</w:t>
+      </w:r>
+    </w:p>
+    <w:p>
+      <w:pPr>
+        <w:pStyle w:val="ListParagraph"/>
+        <w:numPr>
+          <w:ilvl w:val="0"/>
+          <w:numId w:val="2"/>
+        </w:numPr>
+      </w:pPr>
+      <w:r>
+        <w:t xml:space="preserve">On the 67 regional routes outside the e-bus network, that estimate can lengthen the headway (Section 4.7).</w:t>
+      </w:r>
+    </w:p>
+    <w:p>
+      <w:pPr>
+        <w:jc w:val="both"/>
+      </w:pPr>
+      <w:r>
+        <w:t xml:space="preserve">The estimate sets these regional headways and the load factors and demand-sized fleet of Section 5, but not the route set or the tiers. For route </w:t>
+      </w:r>
+      <w:r>
+        <w:rPr>
+          <w:i/>
+          <w:iCs/>
+        </w:rPr>
+        <w:t xml:space="preserve">r</w:t>
+      </w:r>
+      <w:r>
+        <w:t xml:space="preserve"> it is</w:t>
+      </w:r>
+    </w:p>
+    <w:tbl>
+      <w:tblPr>
+        <w:tblW w:type="dxa" w:w="9026"/>
+        <w:tblBorders>
+          <w:top w:val="none" w:color="FFFFFF" w:sz="0"/>
+          <w:left w:val="none" w:color="FFFFFF" w:sz="0"/>
+          <w:bottom w:val="none" w:color="FFFFFF" w:sz="0"/>
+          <w:right w:val="none" w:color="FFFFFF" w:sz="0"/>
+          <w:insideH w:val="none" w:color="FFFFFF" w:sz="0"/>
+          <w:insideV w:val="none" w:color="FFFFFF" w:sz="0"/>
+        </w:tblBorders>
+      </w:tblPr>
+      <w:tblGrid>
+        <w:gridCol w:w="8326"/>
+        <w:gridCol w:w="700"/>
+      </w:tblGrid>
+      <w:tr>
+        <w:trPr>
+          <w:cantSplit/>
+        </w:trPr>
+        <w:tc>
+          <w:tcPr>
+            <w:tcW w:type="dxa" w:w="8326"/>
+            <w:tcBorders>
+              <w:top w:val="none" w:color="FFFFFF" w:sz="0"/>
+              <w:left w:val="none" w:color="FFFFFF" w:sz="0"/>
+              <w:bottom w:val="none" w:color="FFFFFF" w:sz="0"/>
+              <w:right w:val="none" w:color="FFFFFF" w:sz="0"/>
+            </w:tcBorders>
+            <w:vAlign w:val="center"/>
+          </w:tcPr>
+          <w:p>
+            <w:pPr>
+              <w:spacing w:after="100" w:before="100"/>
+              <w:jc w:val="center"/>
+            </w:pPr>
+            <w:r>
+              <w:drawing>
+                <wp:inline distT="0" distB="0" distL="0" distR="0">
+                  <wp:extent cx="3190875" cy="381000"/>
+                  <wp:effectExtent t="0" r="0" b="0" l="0"/>
+                  <wp:docPr id="15" name="eq14" descr="\tilde{D}(r) = \kappa\, g\, m_{type(r)}\, s(r) \sum_{c \in A(r)} \rho_c, \qquad \kappa = 0.33" title="Equation 14"/>
+                  <wp:cNvGraphicFramePr>
+                    <a:graphicFrameLocks xmlns:a="http://schemas.openxmlformats.org/drawingml/2006/main" noChangeAspect="1"/>
+                  </wp:cNvGraphicFramePr>
+                  <a:graphic xmlns:a="http://schemas.openxmlformats.org/drawingml/2006/main">
+                    <a:graphicData uri="http://schemas.openxmlformats.org/drawingml/2006/picture">
+                      <pic:pic xmlns:pic="http://schemas.openxmlformats.org/drawingml/2006/picture">
+                        <pic:nvPicPr>
+                          <pic:cNvPr id="0" name="" descr=""/>
+                          <pic:cNvPicPr>
+                            <a:picLocks noChangeAspect="1" noChangeArrowheads="1"/>
+                          </pic:cNvPicPr>
+                        </pic:nvPicPr>
+                        <pic:blipFill>
+                          <a:blip r:embed="rId22" cstate="none"/>
+                          <a:srcRect/>
+                          <a:stretch>
+                            <a:fillRect/>
+                          </a:stretch>
+                        </pic:blipFill>
+                        <pic:spPr bwMode="auto">
+                          <a:xfrm>
+                            <a:off x="0" y="0"/>
                             <a:ext cx="3190875" cy="381000"/>
                           </a:xfrm>
                           <a:prstGeom prst="rect">
@@ -4241,6 +4241,7 @@
       </w:r>
     </w:p>
     <w:sectPr>
+      <w:footerReference w:type="default" r:id="rId6"/>
       <w:pgSz w:w="11906" w:h="16838" w:orient="portrait"/>
       <w:pgMar w:top="1440" w:right="1440" w:bottom="1440" w:left="1440" w:header="708" w:footer="708" w:gutter="0"/>
       <w:pgNumType/>
@@ -4285,6 +4286,26 @@
     </w:p>
   </w:endnote>
 </w:endnotes>
+</file>
+
+<file path=word/footer1.xml><?xml version="1.0" encoding="utf-8"?>
+<w:ftr xmlns:wpc="http://schemas.microsoft.com/office/word/2010/wordprocessingCanvas" xmlns:mc="http://schemas.openxmlformats.org/markup-compatibility/2006" xmlns:o="urn:schemas-microsoft-com:office:office" xmlns:r="http://schemas.openxmlformats.org/officeDocument/2006/relationships" xmlns:m="http://schemas.openxmlformats.org/officeDocument/2006/math" xmlns:v="urn:schemas-microsoft-com:vml" xmlns:wp14="http://schemas.microsoft.com/office/word/2010/wordprocessingDrawing" xmlns:wp="http://schemas.openxmlformats.org/drawingml/2006/wordprocessingDrawing" xmlns:w10="urn:schemas-microsoft-com:office:word" xmlns:w="http://schemas.openxmlformats.org/wordprocessingml/2006/main" xmlns:w14="http://schemas.microsoft.com/office/word/2010/wordml" xmlns:w15="http://schemas.microsoft.com/office/word/2012/wordml" xmlns:wpg="http://schemas.microsoft.com/office/word/2010/wordprocessingGroup" xmlns:wpi="http://schemas.microsoft.com/office/word/2010/wordprocessingInk" xmlns:wne="http://schemas.microsoft.com/office/word/2006/wordml" xmlns:wps="http://schemas.microsoft.com/office/word/2010/wordprocessingShape">
+  <w:p>
+    <w:pPr>
+      <w:jc w:val="center"/>
+    </w:pPr>
+    <w:r>
+      <w:rPr>
+        <w:sz w:val="20"/>
+        <w:szCs w:val="20"/>
+      </w:rPr>
+      <w:fldChar w:fldCharType="begin"/>
+      <w:instrText xml:space="preserve">PAGE</w:instrText>
+      <w:fldChar w:fldCharType="separate"/>
+      <w:fldChar w:fldCharType="end"/>
+    </w:r>
+  </w:p>
+</w:ftr>
 </file>
 
 <file path=word/footnotes.xml><?xml version="1.0" encoding="utf-8"?>

</xml_diff>